<commit_message>
hapus folder tools, hapus penggunaan -f / --file, hapus dukungan input txt, dan program hanya menerima input prb saja
</commit_message>
<xml_diff>
--- a/subsetsum.docx
+++ b/subsetsum.docx
@@ -1017,6 +1017,8 @@
           <w:lang w:eastAsia="en-ID"/>
         </w:rPr>
       </w:pPr>
+      <w:bookmarkStart w:id="0" w:name="_GoBack"/>
+      <w:bookmarkEnd w:id="0"/>
     </w:p>
     <w:p>
       <w:pPr>
@@ -1030,6 +1032,19 @@
           <w:lang w:eastAsia="en-ID"/>
         </w:rPr>
       </w:pPr>
+    </w:p>
+    <w:p>
+      <w:pPr>
+        <w:shd w:val="clear" w:color="auto" w:fill="FFFFFF"/>
+        <w:spacing w:after="0" w:line="285" w:lineRule="atLeast"/>
+        <w:rPr>
+          <w:rFonts w:ascii="Courier New" w:eastAsia="Times New Roman" w:hAnsi="Courier New" w:cs="Courier New"/>
+          <w:color w:val="000000"/>
+          <w:sz w:val="21"/>
+          <w:szCs w:val="21"/>
+          <w:lang w:eastAsia="en-ID"/>
+        </w:rPr>
+      </w:pPr>
       <w:r>
         <w:rPr>
           <w:rFonts w:ascii="Courier New" w:eastAsia="Times New Roman" w:hAnsi="Courier New" w:cs="Courier New"/>
@@ -1203,7 +1218,7 @@
           <w:szCs w:val="21"/>
           <w:lang w:eastAsia="en-ID"/>
         </w:rPr>
-        <w:t>–</w:t>
+        <w:t>--</w:t>
       </w:r>
       <w:r>
         <w:rPr>
@@ -3298,6 +3313,7 @@
           <w:szCs w:val="20"/>
           <w:lang w:eastAsia="en-ID"/>
         </w:rPr>
+        <w:lastRenderedPageBreak/>
         <w:t>cd</w:t>
       </w:r>
       <w:r>
@@ -3358,7 +3374,6 @@
           <w:szCs w:val="20"/>
           <w:lang w:eastAsia="en-ID"/>
         </w:rPr>
-        <w:lastRenderedPageBreak/>
         <w:t>mkdir</w:t>
       </w:r>
       <w:r>
@@ -9323,10 +9338,7 @@
         <w:t># belum ada .sol — liha</w:t>
       </w:r>
     </w:p>
-    <w:p>
-      <w:bookmarkStart w:id="0" w:name="_GoBack"/>
-      <w:bookmarkEnd w:id="0"/>
-    </w:p>
+    <w:p/>
     <w:sectPr>
       <w:pgSz w:w="11906" w:h="16838"/>
       <w:pgMar w:top="1440" w:right="1440" w:bottom="1440" w:left="1440" w:header="708" w:footer="708" w:gutter="0"/>

</xml_diff>